<commit_message>
auto(daily): dev loop report 2026-05-31
</commit_message>
<xml_diff>
--- a/reports/hypothesis/2026-05-31.docx
+++ b/reports/hypothesis/2026-05-31.docx
@@ -15,7 +15,7 @@
         <w:rPr>
           <w:i/>
         </w:rPr>
-        <w:t>생성일: 2026-05-31 09:15 KST  |  표본: 측정소당 최소 2148건 / 총 10915건</w:t>
+        <w:t>생성일: 2026-05-31 13:48 KST  |  표본: 측정소당 최소 2153건 / 총 10940건</w:t>
       </w:r>
     </w:p>
     <w:p>
@@ -143,7 +143,7 @@
           </w:tcPr>
           <w:p>
             <w:r>
-              <w:t>38.388</w:t>
+              <w:t>38.405</w:t>
             </w:r>
           </w:p>
         </w:tc>
@@ -153,7 +153,7 @@
           </w:tcPr>
           <w:p>
             <w:r>
-              <w:t>34.289</w:t>
+              <w:t>34.274</w:t>
             </w:r>
           </w:p>
         </w:tc>
@@ -163,7 +163,7 @@
           </w:tcPr>
           <w:p>
             <w:r>
-              <w:t>+4.098</w:t>
+              <w:t>+4.131</w:t>
             </w:r>
           </w:p>
         </w:tc>
@@ -215,7 +215,7 @@
           </w:tcPr>
           <w:p>
             <w:r>
-              <w:t>21.360</w:t>
+              <w:t>21.363</w:t>
             </w:r>
           </w:p>
         </w:tc>
@@ -225,7 +225,7 @@
           </w:tcPr>
           <w:p>
             <w:r>
-              <w:t>17.765</w:t>
+              <w:t>17.766</w:t>
             </w:r>
           </w:p>
         </w:tc>
@@ -235,7 +235,7 @@
           </w:tcPr>
           <w:p>
             <w:r>
-              <w:t>+3.595</w:t>
+              <w:t>+3.597</w:t>
             </w:r>
           </w:p>
         </w:tc>
@@ -481,7 +481,7 @@
           </w:tcPr>
           <w:p>
             <w:r>
-              <w:t>+0.20 (작음)</w:t>
+              <w:t>+0.20 (미미함)</w:t>
             </w:r>
           </w:p>
         </w:tc>
@@ -660,7 +660,7 @@
           </w:tcPr>
           <w:p>
             <w:r>
-              <w:t>35.65</w:t>
+              <w:t>36.73</w:t>
             </w:r>
           </w:p>
         </w:tc>
@@ -690,7 +690,7 @@
           </w:tcPr>
           <w:p>
             <w:r>
-              <w:t>0.013</w:t>
+              <w:t>0.014</w:t>
             </w:r>
           </w:p>
         </w:tc>
@@ -722,7 +722,7 @@
           </w:tcPr>
           <w:p>
             <w:r>
-              <w:t>74.96</w:t>
+              <w:t>75.32</w:t>
             </w:r>
           </w:p>
         </w:tc>
@@ -784,7 +784,7 @@
           </w:tcPr>
           <w:p>
             <w:r>
-              <w:t>18.82</w:t>
+              <w:t>18.42</w:t>
             </w:r>
           </w:p>
         </w:tc>
@@ -846,7 +846,7 @@
           </w:tcPr>
           <w:p>
             <w:r>
-              <w:t>136.50</w:t>
+              <w:t>138.01</w:t>
             </w:r>
           </w:p>
         </w:tc>
@@ -876,7 +876,7 @@
           </w:tcPr>
           <w:p>
             <w:r>
-              <w:t>0.049</w:t>
+              <w:t>0.050</w:t>
             </w:r>
           </w:p>
         </w:tc>
@@ -908,7 +908,7 @@
           </w:tcPr>
           <w:p>
             <w:r>
-              <w:t>72.82</w:t>
+              <w:t>72.50</w:t>
             </w:r>
           </w:p>
         </w:tc>
@@ -970,7 +970,7 @@
           </w:tcPr>
           <w:p>
             <w:r>
-              <w:t>152.00</w:t>
+              <w:t>152.68</w:t>
             </w:r>
           </w:p>
         </w:tc>

</xml_diff>